<commit_message>
Show GHL call activity in executive report
</commit_message>
<xml_diff>
--- a/Executive_Report_Training_Guide_v2.docx
+++ b/Executive_Report_Training_Guide_v2.docx
@@ -949,6 +949,41 @@
               <w:pStyle w:val="Compact"/>
             </w:pPr>
             <w:r>
+              <w:t xml:space="preserve">Calls</w:t>
+            </w:r>
+          </w:p>
+        </w:tc>
+        <w:tc>
+          <w:tcPr/>
+          <w:p>
+            <w:pPr>
+              <w:pStyle w:val="Compact"/>
+            </w:pPr>
+            <w:r>
+              <w:t xml:space="preserve">GHL conversation call logs and status breakdown.</w:t>
+            </w:r>
+          </w:p>
+        </w:tc>
+        <w:tc>
+          <w:tcPr/>
+          <w:p>
+            <w:pPr>
+              <w:pStyle w:val="Compact"/>
+            </w:pPr>
+            <w:r>
+              <w:t xml:space="preserve">Use this for answered, missed, voicemail, inbound, and outbound call activity.</w:t>
+            </w:r>
+          </w:p>
+        </w:tc>
+      </w:tr>
+      <w:tr>
+        <w:tc>
+          <w:tcPr/>
+          <w:p>
+            <w:pPr>
+              <w:pStyle w:val="Compact"/>
+            </w:pPr>
+            <w:r>
               <w:t xml:space="preserve">Closed Won</w:t>
             </w:r>
           </w:p>
@@ -1627,7 +1662,7 @@
         </w:numPr>
       </w:pPr>
       <w:r>
-        <w:t xml:space="preserve">Do not assume contacts are created by forms. That is the most common interpretation mistake in this report.</w:t>
+        <w:t xml:space="preserve">Contacts are not always created by forms. Routing, manual CRM entry, imports, and follow-up can also create contacts, which is why the contact count does not always line up with form submissions.</w:t>
       </w:r>
     </w:p>
     <w:p>
@@ -1639,7 +1674,7 @@
         </w:numPr>
       </w:pPr>
       <w:r>
-        <w:t xml:space="preserve">Do not assume the GA4 term</w:t>
+        <w:t xml:space="preserve">The GA4 term</w:t>
       </w:r>
       <w:r>
         <w:t xml:space="preserve"> </w:t>
@@ -1654,7 +1689,7 @@
         <w:t xml:space="preserve"> </w:t>
       </w:r>
       <w:r>
-        <w:t xml:space="preserve">is the same phrase everyone uses for website visits. In this report, we call that metric</w:t>
+        <w:t xml:space="preserve">is not the same phrase everyone uses for website visits, so this report labels the metric</w:t>
       </w:r>
       <w:r>
         <w:t xml:space="preserve"> </w:t>
@@ -1669,7 +1704,7 @@
         <w:t xml:space="preserve"> </w:t>
       </w:r>
       <w:r>
-        <w:t xml:space="preserve">to make the label explicit.</w:t>
+        <w:t xml:space="preserve">to make the meaning clear.</w:t>
       </w:r>
     </w:p>
     <w:p>
@@ -1681,7 +1716,7 @@
         </w:numPr>
       </w:pPr>
       <w:r>
-        <w:t xml:space="preserve">Do not treat the UTM breakdown as a master campaign catalog. It only shows what the data actually observed.</w:t>
+        <w:t xml:space="preserve">The UTM breakdown is a view of what the data actually observed, not a master campaign catalog of everything ever created in GHL.</w:t>
       </w:r>
     </w:p>
     <w:p>
@@ -1693,7 +1728,7 @@
         </w:numPr>
       </w:pPr>
       <w:r>
-        <w:t xml:space="preserve">If someone asks about Acquisition Sources, point them to the dedicated section rather than the channel breakdown.</w:t>
+        <w:t xml:space="preserve">Acquisition Sources is the contact-level section. It is the right place to go when the question is where contacts came from.</w:t>
       </w:r>
     </w:p>
     <w:p>
@@ -1705,7 +1740,7 @@
         </w:numPr>
       </w:pPr>
       <w:r>
-        <w:t xml:space="preserve">If someone asks about Sales Team vs Johns Deals, explain that the payload is the same and the difference is the lens.</w:t>
+        <w:t xml:space="preserve">Sales Team and John’s Deals use the same opportunity payload. The difference is only the lens: one is the team view and the other is the deal-centred view.</w:t>
       </w:r>
     </w:p>
     <w:p>
@@ -1717,7 +1752,7 @@
         </w:numPr>
       </w:pPr>
       <w:r>
-        <w:t xml:space="preserve">If someone asks why a social post is marked Failed, define it as a status value from the ingest, not a subjective judgment.</w:t>
+        <w:t xml:space="preserve">Calls and Conversations show GHL call records grouped by status. That is the place to explain call activity without mixing it up with SMS or appointments.</w:t>
       </w:r>
     </w:p>
     <w:p>
@@ -1729,7 +1764,7 @@
         </w:numPr>
       </w:pPr>
       <w:r>
-        <w:t xml:space="preserve">If someone asks what the date range means, say it is trailing complete days ending yesterday, not a click-day-dependent calendar block.</w:t>
+        <w:t xml:space="preserve">A social post marked Failed means the latest recorded status is failed or error. It is a status value from the ingest, not a subjective review of the post.</w:t>
       </w:r>
     </w:p>
     <w:p>
@@ -1741,7 +1776,19 @@
         </w:numPr>
       </w:pPr>
       <w:r>
-        <w:t xml:space="preserve">If someone asks what counts as an active opportunity, say the report now separates open opportunities from worked opportunities and stage movers. Active means open in the latest snapshot; worked means updated or moved stage in the window.</w:t>
+        <w:t xml:space="preserve">The date range is a trailing complete-day window ending yesterday. That means the selected range always points to finished days, not a click-day-dependent calendar block.</w:t>
+      </w:r>
+    </w:p>
+    <w:p>
+      <w:pPr>
+        <w:pStyle w:val="Compact"/>
+        <w:numPr>
+          <w:ilvl w:val="0"/>
+          <w:numId w:val="1003"/>
+        </w:numPr>
+      </w:pPr>
+      <w:r>
+        <w:t xml:space="preserve">Active opportunities are the open deals in the latest snapshot. Worked opportunities are the open deals that were updated or moved stage inside the selected window, and stage movers are the ones that actually changed stage.</w:t>
       </w:r>
     </w:p>
     <w:bookmarkEnd w:id="14"/>
@@ -1760,6 +1807,22 @@
       </w:pPr>
       <w:r>
         <w:t xml:space="preserve">Naming standards matter because the report can only group what is named consistently. This section should be read as part of the measurement contract, not as optional marketing style guidance.</w:t>
+      </w:r>
+    </w:p>
+    <w:p>
+      <w:pPr>
+        <w:pStyle w:val="BodyText"/>
+      </w:pPr>
+      <w:r>
+        <w:t xml:space="preserve">The UTM fields themselves are standard. The exact naming pattern we use for campaigns, ad sets, ads, and landing pages is our internal house standard so the data stays readable and groupable.</w:t>
+      </w:r>
+    </w:p>
+    <w:p>
+      <w:pPr>
+        <w:pStyle w:val="BodyText"/>
+      </w:pPr>
+      <w:r>
+        <w:t xml:space="preserve">That means the tracking fields are not the problem. The important part is making sure every ad link, landing page, and contact intake path writes into those fields the same way every time.</w:t>
       </w:r>
     </w:p>
     <w:p>
@@ -1990,6 +2053,14 @@
       </w:pPr>
       <w:r>
         <w:t xml:space="preserve">Safe now</w:t>
+      </w:r>
+    </w:p>
+    <w:p>
+      <w:pPr>
+        <w:pStyle w:val="FirstParagraph"/>
+      </w:pPr>
+      <w:r>
+        <w:t xml:space="preserve">The report already has UTM capture fields in GHL. The practical improvement is to make sure every ad, page, and contact path writes into those fields the same way every time.</w:t>
       </w:r>
     </w:p>
     <w:tbl>
@@ -2321,7 +2392,67 @@
               <w:pStyle w:val="Compact"/>
             </w:pPr>
             <w:r>
-              <w:t xml:space="preserve">Clean names make the report group results correctly and reduce manual cleanup.</w:t>
+              <w:t xml:space="preserve">Clean names make the report group results correctly and reduce manual cleanup. The existing</w:t>
+            </w:r>
+            <w:r>
+              <w:t xml:space="preserve"> </w:t>
+            </w:r>
+            <w:r>
+              <w:rPr>
+                <w:rStyle w:val="VerbatimChar"/>
+              </w:rPr>
+              <w:t xml:space="preserve">UTM Source First/Last</w:t>
+            </w:r>
+            <w:r>
+              <w:t xml:space="preserve">,</w:t>
+            </w:r>
+            <w:r>
+              <w:t xml:space="preserve"> </w:t>
+            </w:r>
+            <w:r>
+              <w:rPr>
+                <w:rStyle w:val="VerbatimChar"/>
+              </w:rPr>
+              <w:t xml:space="preserve">UTM Medium First/Last</w:t>
+            </w:r>
+            <w:r>
+              <w:t xml:space="preserve">,</w:t>
+            </w:r>
+            <w:r>
+              <w:t xml:space="preserve"> </w:t>
+            </w:r>
+            <w:r>
+              <w:rPr>
+                <w:rStyle w:val="VerbatimChar"/>
+              </w:rPr>
+              <w:t xml:space="preserve">UTM Campaign First/Last</w:t>
+            </w:r>
+            <w:r>
+              <w:t xml:space="preserve">,</w:t>
+            </w:r>
+            <w:r>
+              <w:t xml:space="preserve"> </w:t>
+            </w:r>
+            <w:r>
+              <w:rPr>
+                <w:rStyle w:val="VerbatimChar"/>
+              </w:rPr>
+              <w:t xml:space="preserve">UTM Content First/Last</w:t>
+            </w:r>
+            <w:r>
+              <w:t xml:space="preserve">,</w:t>
+            </w:r>
+            <w:r>
+              <w:t xml:space="preserve"> </w:t>
+            </w:r>
+            <w:r>
+              <w:rPr>
+                <w:rStyle w:val="VerbatimChar"/>
+              </w:rPr>
+              <w:t xml:space="preserve">UTM Term First/Last</w:t>
+            </w:r>
+            <w:r>
+              <w:t xml:space="preserve">, and landing page fields are already there to hold this data. The pattern itself is our house standard, built on common UTM fields.</w:t>
             </w:r>
           </w:p>
         </w:tc>
@@ -2356,7 +2487,7 @@
               <w:pStyle w:val="Compact"/>
             </w:pPr>
             <w:r>
-              <w:t xml:space="preserve">This helps the team tell the difference between something we launched on purpose and something the report never saw.</w:t>
+              <w:t xml:space="preserve">This helps the team tell the difference between something we launched on purpose and something the report never saw, and it makes it easier to check whether the existing UTM fields were filled correctly.</w:t>
             </w:r>
           </w:p>
         </w:tc>

</xml_diff>

<commit_message>
Fix dialer timezone: fall back to GHL contact tz or CT safe window (12-2pm)
</commit_message>
<xml_diff>
--- a/Executive_Report_Training_Guide_v2.docx
+++ b/Executive_Report_Training_Guide_v2.docx
@@ -104,6 +104,11 @@
       </w:r>
     </w:p>
     <w:p>
+      <w:r>
+        <w:t>Top Pages: This is a short website page summary based on the landing-page rollup we already capture. It shows the pages that received the most recorded visits, plus form and opportunity activity when available.</w:t>
+      </w:r>
+    </w:p>
+    <w:p>
       <w:pPr>
         <w:pStyle w:val="Compact"/>
         <w:numPr>
@@ -328,127 +333,7 @@
         </w:numPr>
       </w:pPr>
       <w:r>
-        <w:t xml:space="preserve">Response shape: the API returns</w:t>
-      </w:r>
-      <w:r>
-        <w:t xml:space="preserve"> </w:t>
-      </w:r>
-      <w:r>
-        <w:rPr>
-          <w:rStyle w:val="VerbatimChar"/>
-        </w:rPr>
-        <w:t xml:space="preserve">summary</w:t>
-      </w:r>
-      <w:r>
-        <w:t xml:space="preserve">,</w:t>
-      </w:r>
-      <w:r>
-        <w:t xml:space="preserve"> </w:t>
-      </w:r>
-      <w:r>
-        <w:rPr>
-          <w:rStyle w:val="VerbatimChar"/>
-        </w:rPr>
-        <w:t xml:space="preserve">channelBreakdown</w:t>
-      </w:r>
-      <w:r>
-        <w:t xml:space="preserve">,</w:t>
-      </w:r>
-      <w:r>
-        <w:t xml:space="preserve"> </w:t>
-      </w:r>
-      <w:r>
-        <w:rPr>
-          <w:rStyle w:val="VerbatimChar"/>
-        </w:rPr>
-        <w:t xml:space="preserve">utmBreakdown</w:t>
-      </w:r>
-      <w:r>
-        <w:t xml:space="preserve">,</w:t>
-      </w:r>
-      <w:r>
-        <w:t xml:space="preserve"> </w:t>
-      </w:r>
-      <w:r>
-        <w:rPr>
-          <w:rStyle w:val="VerbatimChar"/>
-        </w:rPr>
-        <w:t xml:space="preserve">metaAttribution</w:t>
-      </w:r>
-      <w:r>
-        <w:t xml:space="preserve">,</w:t>
-      </w:r>
-      <w:r>
-        <w:t xml:space="preserve"> </w:t>
-      </w:r>
-      <w:r>
-        <w:rPr>
-          <w:rStyle w:val="VerbatimChar"/>
-        </w:rPr>
-        <w:t xml:space="preserve">contactSources</w:t>
-      </w:r>
-      <w:r>
-        <w:t xml:space="preserve">,</w:t>
-      </w:r>
-      <w:r>
-        <w:t xml:space="preserve"> </w:t>
-      </w:r>
-      <w:r>
-        <w:rPr>
-          <w:rStyle w:val="VerbatimChar"/>
-        </w:rPr>
-        <w:t xml:space="preserve">pipelineDropoff</w:t>
-      </w:r>
-      <w:r>
-        <w:t xml:space="preserve">,</w:t>
-      </w:r>
-      <w:r>
-        <w:t xml:space="preserve"> </w:t>
-      </w:r>
-      <w:r>
-        <w:rPr>
-          <w:rStyle w:val="VerbatimChar"/>
-        </w:rPr>
-        <w:t xml:space="preserve">stageDropoff</w:t>
-      </w:r>
-      <w:r>
-        <w:t xml:space="preserve">,</w:t>
-      </w:r>
-      <w:r>
-        <w:t xml:space="preserve"> </w:t>
-      </w:r>
-      <w:r>
-        <w:rPr>
-          <w:rStyle w:val="VerbatimChar"/>
-        </w:rPr>
-        <w:t xml:space="preserve">stageVelocity</w:t>
-      </w:r>
-      <w:r>
-        <w:t xml:space="preserve">,</w:t>
-      </w:r>
-      <w:r>
-        <w:t xml:space="preserve"> </w:t>
-      </w:r>
-      <w:r>
-        <w:rPr>
-          <w:rStyle w:val="VerbatimChar"/>
-        </w:rPr>
-        <w:t xml:space="preserve">appointments</w:t>
-      </w:r>
-      <w:r>
-        <w:t xml:space="preserve">, and</w:t>
-      </w:r>
-      <w:r>
-        <w:t xml:space="preserve"> </w:t>
-      </w:r>
-      <w:r>
-        <w:rPr>
-          <w:rStyle w:val="VerbatimChar"/>
-        </w:rPr>
-        <w:t xml:space="preserve">health</w:t>
-      </w:r>
-      <w:r>
-        <w:t xml:space="preserve">.</w:t>
+        <w:t>Response shape: the API returns summary, channelBreakdown, utmBreakdown, metaAttribution, contactSources, topPages, pipelineDropoff, stageDropoff, stageVelocity, appointments, and health.</w:t>
       </w:r>
     </w:p>
     <w:p>
@@ -1641,6 +1526,38 @@
           </w:p>
         </w:tc>
       </w:tr>
+      <w:tr>
+        <w:tc>
+          <w:tcPr>
+            <w:tcW w:type="dxa" w:w="2640"/>
+          </w:tcPr>
+          <w:p>
+            <w:r>
+              <w:t>Top Pages</w:t>
+            </w:r>
+          </w:p>
+        </w:tc>
+        <w:tc>
+          <w:tcPr>
+            <w:tcW w:type="dxa" w:w="2640"/>
+          </w:tcPr>
+          <w:p>
+            <w:r>
+              <w:t>The short website page summary based on the landing-page rollup.</w:t>
+            </w:r>
+          </w:p>
+        </w:tc>
+        <w:tc>
+          <w:tcPr>
+            <w:tcW w:type="dxa" w:w="2640"/>
+          </w:tcPr>
+          <w:p>
+            <w:r>
+              <w:t>Use this when someone wants to know which pages are getting the most recorded visits.</w:t>
+            </w:r>
+          </w:p>
+        </w:tc>
+      </w:tr>
     </w:tbl>
     <w:bookmarkEnd w:id="12"/>
     <w:bookmarkEnd w:id="13"/>
@@ -2538,6 +2455,38 @@
           </w:p>
         </w:tc>
       </w:tr>
+      <w:tr>
+        <w:tc>
+          <w:tcPr>
+            <w:tcW w:type="dxa" w:w="2640"/>
+          </w:tcPr>
+          <w:p>
+            <w:r>
+              <w:t>Show a short summary of the most visited pages.</w:t>
+            </w:r>
+          </w:p>
+        </w:tc>
+        <w:tc>
+          <w:tcPr>
+            <w:tcW w:type="dxa" w:w="2640"/>
+          </w:tcPr>
+          <w:p>
+            <w:r>
+              <w:t>Leadership can quickly see which pages are drawing the most attention without opening a separate analytics tool.</w:t>
+            </w:r>
+          </w:p>
+        </w:tc>
+        <w:tc>
+          <w:tcPr>
+            <w:tcW w:type="dxa" w:w="2640"/>
+          </w:tcPr>
+          <w:p>
+            <w:r>
+              <w:t>Uses the landing-page rollup we already have.</w:t>
+            </w:r>
+          </w:p>
+        </w:tc>
+      </w:tr>
     </w:tbl>
     <w:bookmarkEnd w:id="16"/>
     <w:bookmarkStart w:id="17" w:name="needs-more-setup"/>
@@ -3218,6 +3167,7 @@
       </w:tr>
     </w:tbl>
     <w:bookmarkEnd w:id="20"/>
+    <w:p/>
     <w:sectPr>
       <w:footnotePr>
         <w:numRestart w:val="eachSect"/>

</xml_diff>